<commit_message>
TO_HOME ride creation and adding a passenger
</commit_message>
<xml_diff>
--- a/documents/Peer Review PartB.docx
+++ b/documents/Peer Review PartB.docx
@@ -43,21 +43,12 @@
           <w:rtl/>
         </w:rPr>
       </w:pPr>
-      <w:proofErr w:type="spellStart"/>
-      <w:r>
-        <w:rPr>
-          <w:rFonts w:hint="cs"/>
-          <w:rtl/>
-        </w:rPr>
-        <w:t>ליגלינק</w:t>
-      </w:r>
-      <w:proofErr w:type="spellEnd"/>
-      <w:r>
-        <w:rPr>
-          <w:rFonts w:hint="cs"/>
-          <w:rtl/>
-        </w:rPr>
-        <w:t xml:space="preserve"> (שי </w:t>
+      <w:r>
+        <w:rPr>
+          <w:rFonts w:hint="cs"/>
+          <w:rtl/>
+        </w:rPr>
+        <w:t xml:space="preserve">ליגלינק (שי </w:t>
       </w:r>
       <w:r>
         <w:rPr>
@@ -86,21 +77,12 @@
         </w:rPr>
         <w:t xml:space="preserve"> </w:t>
       </w:r>
-      <w:proofErr w:type="spellStart"/>
-      <w:r>
-        <w:rPr>
-          <w:rFonts w:hint="cs"/>
-          <w:rtl/>
-        </w:rPr>
-        <w:t>אפליקצייה</w:t>
-      </w:r>
-      <w:proofErr w:type="spellEnd"/>
-      <w:r>
-        <w:rPr>
-          <w:rFonts w:hint="cs"/>
-          <w:rtl/>
-        </w:rPr>
-        <w:t xml:space="preserve"> ליצירת תחרויות , נמצאים ב</w:t>
+      <w:r>
+        <w:rPr>
+          <w:rFonts w:hint="cs"/>
+          <w:rtl/>
+        </w:rPr>
+        <w:t>אפליקצייה ליצירת תחרויות , נמצאים ב</w:t>
       </w:r>
       <w:r>
         <w:rPr>
@@ -114,23 +96,7 @@
           <w:rFonts w:hint="cs"/>
           <w:rtl/>
         </w:rPr>
-        <w:t xml:space="preserve">לב מתקדם מבחינת הוספת משתמשים, חווית משתמש וחיבור </w:t>
-      </w:r>
-      <w:proofErr w:type="spellStart"/>
-      <w:r>
-        <w:rPr>
-          <w:rFonts w:hint="cs"/>
-          <w:rtl/>
-        </w:rPr>
-        <w:t>ומימשוק</w:t>
-      </w:r>
-      <w:proofErr w:type="spellEnd"/>
-      <w:r>
-        <w:rPr>
-          <w:rFonts w:hint="cs"/>
-          <w:rtl/>
-        </w:rPr>
-        <w:t xml:space="preserve"> בין ה</w:t>
+        <w:t>לב מתקדם מבחינת הוספת משתמשים, חווית משתמש וחיבור ומימשוק בין ה</w:t>
       </w:r>
       <w:r>
         <w:t>firebase</w:t>
@@ -166,11 +132,9 @@
         </w:rPr>
         <w:t>יוחאי ורפאל (</w:t>
       </w:r>
-      <w:proofErr w:type="spellStart"/>
       <w:r>
         <w:t>PazHelper</w:t>
       </w:r>
-      <w:proofErr w:type="spellEnd"/>
       <w:r>
         <w:rPr>
           <w:rFonts w:hint="cs"/>
@@ -202,10 +166,330 @@
     <w:p>
       <w:pPr>
         <w:rPr>
-          <w:rFonts w:hint="cs"/>
           <w:rtl/>
         </w:rPr>
       </w:pPr>
+      <w:r>
+        <w:rPr>
+          <w:rFonts w:hint="cs"/>
+          <w:rtl/>
+        </w:rPr>
+        <w:t xml:space="preserve">מיכאל ודור </w:t>
+      </w:r>
+      <w:r>
+        <w:rPr>
+          <w:rtl/>
+        </w:rPr>
+        <w:t>–</w:t>
+      </w:r>
+      <w:r>
+        <w:rPr>
+          <w:rFonts w:hint="cs"/>
+          <w:rtl/>
+        </w:rPr>
+        <w:t xml:space="preserve"> </w:t>
+      </w:r>
+    </w:p>
+    <w:p>
+      <w:pPr>
+        <w:rPr>
+          <w:rFonts w:hint="cs"/>
+          <w:rtl/>
+        </w:rPr>
+      </w:pPr>
+      <w:r>
+        <w:rPr>
+          <w:rFonts w:hint="cs"/>
+          <w:rtl/>
+        </w:rPr>
+        <w:t xml:space="preserve">גל ולינה </w:t>
+      </w:r>
+      <w:r>
+        <w:rPr>
+          <w:rtl/>
+        </w:rPr>
+        <w:t>–</w:t>
+      </w:r>
+      <w:r>
+        <w:rPr>
+          <w:rFonts w:hint="cs"/>
+          <w:rtl/>
+        </w:rPr>
+        <w:t xml:space="preserve"> התקדמות ממש יפה. </w:t>
+      </w:r>
+      <w:r>
+        <w:t>Ui</w:t>
+      </w:r>
+      <w:r>
+        <w:rPr>
+          <w:rFonts w:hint="cs"/>
+          <w:rtl/>
+        </w:rPr>
+        <w:t xml:space="preserve"> מאוד מתקדם וידידותי למשתמש, המודל עדיין לא מעודכן ולא רץ אבל שאר הפיצ'רים כבר עובדים ונראים מאוד יפה.</w:t>
+      </w:r>
+      <w:r>
+        <w:rPr>
+          <w:rFonts w:hint="cs"/>
+          <w:rtl/>
+        </w:rPr>
+        <w:t xml:space="preserve"> (מערכת למציאת בעלי חיים אבודים </w:t>
+      </w:r>
+      <w:r>
+        <w:rPr>
+          <w:rtl/>
+        </w:rPr>
+        <w:t>–</w:t>
+      </w:r>
+      <w:r>
+        <w:rPr>
+          <w:rFonts w:hint="cs"/>
+          <w:rtl/>
+        </w:rPr>
+        <w:t xml:space="preserve"> סוג של רשת חברתית)</w:t>
+      </w:r>
+    </w:p>
+    <w:p>
+      <w:pPr>
+        <w:rPr>
+          <w:rtl/>
+        </w:rPr>
+      </w:pPr>
+      <w:r>
+        <w:rPr>
+          <w:rFonts w:hint="cs"/>
+          <w:rtl/>
+        </w:rPr>
+        <w:t xml:space="preserve">שלומי, ליעד ובן </w:t>
+      </w:r>
+      <w:r>
+        <w:rPr>
+          <w:rtl/>
+        </w:rPr>
+        <w:t>–</w:t>
+      </w:r>
+      <w:r>
+        <w:rPr>
+          <w:rFonts w:hint="cs"/>
+          <w:rtl/>
+        </w:rPr>
+        <w:t xml:space="preserve"> ה</w:t>
+      </w:r>
+      <w:r>
+        <w:t>UI</w:t>
+      </w:r>
+      <w:r>
+        <w:rPr>
+          <w:rFonts w:hint="cs"/>
+          <w:rtl/>
+        </w:rPr>
+        <w:t xml:space="preserve"> עדיין לא מעודכן מבחינת חיבור לדאטה בייס. הקריאות מהאתרי אינטרנט של אתרי הקניות והאלגוריתם עדיין לא מוטעמים בקוד. יש עוד הרבה עבודה ב</w:t>
+      </w:r>
+      <w:r>
+        <w:t>Backend</w:t>
+      </w:r>
+      <w:r>
+        <w:rPr>
+          <w:rFonts w:hint="cs"/>
+          <w:rtl/>
+        </w:rPr>
+        <w:t>.</w:t>
+      </w:r>
+      <w:r>
+        <w:rPr>
+          <w:rFonts w:hint="cs"/>
+          <w:rtl/>
+        </w:rPr>
+        <w:t xml:space="preserve"> (מערכת שמביאה את סל הקניות הכי טוב)</w:t>
+      </w:r>
+    </w:p>
+    <w:p>
+      <w:pPr>
+        <w:rPr>
+          <w:rtl/>
+        </w:rPr>
+      </w:pPr>
+      <w:r>
+        <w:rPr>
+          <w:rFonts w:hint="cs"/>
+          <w:rtl/>
+        </w:rPr>
+        <w:t xml:space="preserve">ליאור ועידו </w:t>
+      </w:r>
+      <w:r>
+        <w:rPr>
+          <w:rtl/>
+        </w:rPr>
+        <w:t>–</w:t>
+      </w:r>
+      <w:r>
+        <w:rPr>
+          <w:rFonts w:hint="cs"/>
+          <w:rtl/>
+        </w:rPr>
+        <w:t xml:space="preserve"> העיצוב של האתר נראה מאוד טוב, שימוש יפה עם </w:t>
+      </w:r>
+      <w:r>
+        <w:t>gemini</w:t>
+      </w:r>
+      <w:r>
+        <w:rPr>
+          <w:rFonts w:hint="cs"/>
+          <w:rtl/>
+        </w:rPr>
+        <w:t xml:space="preserve"> על מנת לפלטר תגיות מסוימות גם של תמונות קיימות שאפשר להעלות לאתר.</w:t>
+      </w:r>
+      <w:r>
+        <w:rPr>
+          <w:rFonts w:hint="cs"/>
+          <w:rtl/>
+        </w:rPr>
+        <w:t xml:space="preserve"> האלגוריתם של לפלטר תגיות ולהוציא אותן מתוך תמונות קיימות או </w:t>
+      </w:r>
+      <w:r>
+        <w:t>prompt</w:t>
+      </w:r>
+      <w:r>
+        <w:rPr>
+          <w:rFonts w:hint="cs"/>
+          <w:rtl/>
+        </w:rPr>
+        <w:t xml:space="preserve"> מסוים הוא יפה. (מערכת קעקועים)</w:t>
+      </w:r>
+    </w:p>
+    <w:p>
+      <w:pPr>
+        <w:rPr>
+          <w:rtl/>
+        </w:rPr>
+      </w:pPr>
+      <w:r>
+        <w:rPr>
+          <w:rFonts w:hint="cs"/>
+          <w:rtl/>
+        </w:rPr>
+        <w:t>עומרי, ניב ואמיתי (</w:t>
+      </w:r>
+      <w:r>
+        <w:t>APEX</w:t>
+      </w:r>
+      <w:r>
+        <w:rPr>
+          <w:rFonts w:hint="cs"/>
+          <w:rtl/>
+        </w:rPr>
+        <w:t xml:space="preserve">) </w:t>
+      </w:r>
+      <w:r>
+        <w:rPr>
+          <w:rtl/>
+        </w:rPr>
+        <w:t>–</w:t>
+      </w:r>
+      <w:r>
+        <w:rPr>
+          <w:rFonts w:hint="cs"/>
+          <w:rtl/>
+        </w:rPr>
+        <w:t xml:space="preserve"> מערכת של </w:t>
+      </w:r>
+      <w:r>
+        <w:t>ai</w:t>
+      </w:r>
+      <w:r>
+        <w:rPr>
+          <w:rFonts w:hint="cs"/>
+          <w:rtl/>
+        </w:rPr>
+        <w:t xml:space="preserve"> כדי לייעל את החיפוש בכל התקנונים של אפקה. לפי חיפוש מסוים אפשר להוציא תשובה מדויקת מהתקנונים. התשתית מאחורי האלגוריתם יחסית מוכנה אבל המודל עצמו עדיין לא מוכן ולא מחובר </w:t>
+      </w:r>
+      <w:r>
+        <w:rPr>
+          <w:rtl/>
+        </w:rPr>
+        <w:t>–</w:t>
+      </w:r>
+      <w:r>
+        <w:rPr>
+          <w:rFonts w:hint="cs"/>
+          <w:rtl/>
+        </w:rPr>
+        <w:t xml:space="preserve"> זה עיקר המערכת.</w:t>
+      </w:r>
+    </w:p>
+    <w:p>
+      <w:pPr>
+        <w:rPr>
+          <w:rFonts w:hint="cs"/>
+          <w:rtl/>
+        </w:rPr>
+      </w:pPr>
+      <w:r>
+        <w:rPr>
+          <w:rFonts w:hint="cs"/>
+          <w:rtl/>
+        </w:rPr>
+        <w:t xml:space="preserve">שירן רייך ועדי ורד </w:t>
+      </w:r>
+      <w:r>
+        <w:rPr>
+          <w:rtl/>
+        </w:rPr>
+        <w:t>–</w:t>
+      </w:r>
+      <w:r>
+        <w:rPr>
+          <w:rFonts w:hint="cs"/>
+          <w:rtl/>
+        </w:rPr>
+        <w:t xml:space="preserve"> מערכת ליצירת פאזלים (</w:t>
+      </w:r>
+      <w:r>
+        <w:t>PuzzLink</w:t>
+      </w:r>
+      <w:r>
+        <w:rPr>
+          <w:rFonts w:hint="cs"/>
+          <w:rtl/>
+        </w:rPr>
+        <w:t xml:space="preserve">). המערכת גם יכולה ליצור משחקים בין משתמשים. המשחק הוא פתירת פאזל, אפשר גם בתורות. האפשר להעלות למערכת תמונה והיא מייצרת פאזל או באמצעות </w:t>
+      </w:r>
+      <w:r>
+        <w:t>ai</w:t>
+      </w:r>
+      <w:r>
+        <w:rPr>
+          <w:rFonts w:hint="cs"/>
+          <w:rtl/>
+        </w:rPr>
+        <w:t xml:space="preserve"> עם </w:t>
+      </w:r>
+      <w:r>
+        <w:t>prompt</w:t>
+      </w:r>
+      <w:r>
+        <w:rPr>
+          <w:rFonts w:hint="cs"/>
+          <w:rtl/>
+        </w:rPr>
+        <w:t>.</w:t>
+      </w:r>
+      <w:r>
+        <w:rPr>
+          <w:rFonts w:hint="cs"/>
+          <w:rtl/>
+        </w:rPr>
+        <w:t xml:space="preserve"> עיצוב </w:t>
+      </w:r>
+      <w:r>
+        <w:t>ui</w:t>
+      </w:r>
+      <w:r>
+        <w:rPr>
+          <w:rFonts w:hint="cs"/>
+          <w:rtl/>
+        </w:rPr>
+        <w:t xml:space="preserve"> יפה ואינטואיטיבי. יש גם צ'אט נחמד במשחק עצמו.</w:t>
+      </w:r>
     </w:p>
     <w:sectPr>
       <w:pgSz w:w="11906" w:h="16838"/>

</xml_diff>

<commit_message>
notifications and cancellation checks
</commit_message>
<xml_diff>
--- a/documents/Peer Review PartB.docx
+++ b/documents/Peer Review PartB.docx
@@ -3,90 +3,925 @@
 <w:document xmlns:wpc="http://schemas.microsoft.com/office/word/2010/wordprocessingCanvas" xmlns:cx="http://schemas.microsoft.com/office/drawing/2014/chartex" xmlns:cx1="http://schemas.microsoft.com/office/drawing/2015/9/8/chartex" xmlns:cx2="http://schemas.microsoft.com/office/drawing/2015/10/21/chartex" xmlns:cx3="http://schemas.microsoft.com/office/drawing/2016/5/9/chartex" xmlns:cx4="http://schemas.microsoft.com/office/drawing/2016/5/10/chartex" xmlns:cx5="http://schemas.microsoft.com/office/drawing/2016/5/11/chartex" xmlns:cx6="http://schemas.microsoft.com/office/drawing/2016/5/12/chartex" xmlns:cx7="http://schemas.microsoft.com/office/drawing/2016/5/13/chartex" xmlns:cx8="http://schemas.microsoft.com/office/drawing/2016/5/14/chartex" xmlns:mc="http://schemas.openxmlformats.org/markup-compatibility/2006" xmlns:aink="http://schemas.microsoft.com/office/drawing/2016/ink" xmlns:am3d="http://schemas.microsoft.com/office/drawing/2017/model3d" xmlns:o="urn:schemas-microsoft-com:office:office" xmlns:oel="http://schemas.microsoft.com/office/2019/extlst" xmlns:r="http://schemas.openxmlformats.org/officeDocument/2006/relationships" xmlns:m="http://schemas.openxmlformats.org/officeDocument/2006/math" xmlns:v="urn:schemas-microsoft-com:vml" xmlns:wp14="http://schemas.microsoft.com/office/word/2010/wordprocessingDrawing" xmlns:wp="http://schemas.openxmlformats.org/drawingml/2006/wordprocessingDrawing" xmlns:w10="urn:schemas-microsoft-com:office:word" xmlns:w="http://schemas.openxmlformats.org/wordprocessingml/2006/main" xmlns:w14="http://schemas.microsoft.com/office/word/2010/wordml" xmlns:w15="http://schemas.microsoft.com/office/word/2012/wordml" xmlns:w16cex="http://schemas.microsoft.com/office/word/2018/wordml/cex" xmlns:w16cid="http://schemas.microsoft.com/office/word/2016/wordml/cid" xmlns:w16="http://schemas.microsoft.com/office/word/2018/wordml" xmlns:w16du="http://schemas.microsoft.com/office/word/2023/wordml/word16du" xmlns:w16sdtdh="http://schemas.microsoft.com/office/word/2020/wordml/sdtdatahash" xmlns:w16sdtfl="http://schemas.microsoft.com/office/word/2024/wordml/sdtformatlock" xmlns:w16se="http://schemas.microsoft.com/office/word/2015/wordml/symex" xmlns:wpg="http://schemas.microsoft.com/office/word/2010/wordprocessingGroup" xmlns:wpi="http://schemas.microsoft.com/office/word/2010/wordprocessingInk" xmlns:wne="http://schemas.microsoft.com/office/word/2006/wordml" xmlns:wps="http://schemas.microsoft.com/office/word/2010/wordprocessingShape" mc:Ignorable="w14 w15 w16se w16cid w16 w16cex w16sdtdh w16sdtfl w16du wp14">
   <w:body>
     <w:p>
-      <w:r>
+      <w:pPr>
+        <w:jc w:val="center"/>
+        <w:rPr>
+          <w:b/>
+          <w:bCs/>
+          <w:sz w:val="40"/>
+          <w:szCs w:val="40"/>
+        </w:rPr>
+      </w:pPr>
+      <w:r>
+        <w:rPr>
+          <w:b/>
+          <w:bCs/>
+          <w:sz w:val="40"/>
+          <w:szCs w:val="40"/>
+        </w:rPr>
+        <w:t>Peer review – Final project</w:t>
+      </w:r>
+    </w:p>
+    <w:p>
+      <w:pPr>
+        <w:jc w:val="right"/>
+        <w:rPr>
+          <w:sz w:val="28"/>
+          <w:szCs w:val="28"/>
+          <w:u w:val="single"/>
+        </w:rPr>
+      </w:pPr>
+      <w:r>
+        <w:rPr>
+          <w:sz w:val="28"/>
+          <w:szCs w:val="28"/>
+          <w:u w:val="single"/>
+        </w:rPr>
+        <w:t xml:space="preserve">Submitted by : </w:t>
+      </w:r>
+    </w:p>
+    <w:p>
+      <w:pPr>
+        <w:jc w:val="right"/>
+        <w:rPr>
+          <w:sz w:val="28"/>
+          <w:szCs w:val="28"/>
+          <w:u w:val="single"/>
+        </w:rPr>
+      </w:pPr>
+      <w:r>
+        <w:rPr>
+          <w:sz w:val="28"/>
+          <w:szCs w:val="28"/>
+          <w:u w:val="single"/>
+        </w:rPr>
+        <w:t xml:space="preserve">Aviel </w:t>
+      </w:r>
+      <w:proofErr w:type="spellStart"/>
+      <w:r>
+        <w:rPr>
+          <w:sz w:val="28"/>
+          <w:szCs w:val="28"/>
+          <w:u w:val="single"/>
+        </w:rPr>
+        <w:t>smolanski</w:t>
+      </w:r>
+      <w:proofErr w:type="spellEnd"/>
+      <w:r>
+        <w:rPr>
+          <w:sz w:val="28"/>
+          <w:szCs w:val="28"/>
+          <w:u w:val="single"/>
+        </w:rPr>
+        <w:t xml:space="preserve"> </w:t>
+      </w:r>
+      <w:r>
+        <w:rPr>
+          <w:sz w:val="28"/>
+          <w:szCs w:val="28"/>
+          <w:u w:val="single"/>
+        </w:rPr>
+        <w:t>206580276</w:t>
+      </w:r>
+    </w:p>
+    <w:p>
+      <w:pPr>
+        <w:jc w:val="right"/>
+        <w:rPr>
+          <w:sz w:val="28"/>
+          <w:szCs w:val="28"/>
+          <w:u w:val="single"/>
+        </w:rPr>
+      </w:pPr>
+      <w:r>
+        <w:rPr>
+          <w:sz w:val="28"/>
+          <w:szCs w:val="28"/>
+          <w:u w:val="single"/>
+        </w:rPr>
+        <w:t>Elio</w:t>
+      </w:r>
+      <w:r>
+        <w:rPr>
+          <w:sz w:val="28"/>
+          <w:szCs w:val="28"/>
+          <w:u w:val="single"/>
+        </w:rPr>
+        <w:t>r Uzan 318381621</w:t>
+      </w:r>
+    </w:p>
+    <w:p>
+      <w:pPr>
+        <w:jc w:val="right"/>
+        <w:rPr>
+          <w:sz w:val="24"/>
+          <w:szCs w:val="24"/>
+        </w:rPr>
+      </w:pPr>
+    </w:p>
+    <w:p>
+      <w:pPr>
+        <w:jc w:val="right"/>
         <w:rPr>
           <w:rFonts w:hint="cs"/>
-          <w:rtl/>
-        </w:rPr>
-        <w:t xml:space="preserve">שי ודניאל </w:t>
-      </w:r>
-      <w:r>
-        <w:rPr>
-          <w:rtl/>
-        </w:rPr>
-        <w:t>–</w:t>
-      </w:r>
+          <w:b/>
+          <w:bCs/>
+          <w:sz w:val="28"/>
+          <w:szCs w:val="28"/>
+          <w:rtl/>
+        </w:rPr>
+      </w:pPr>
+      <w:r>
+        <w:rPr>
+          <w:b/>
+          <w:bCs/>
+          <w:sz w:val="28"/>
+          <w:szCs w:val="28"/>
+        </w:rPr>
+        <w:t xml:space="preserve">The following represent our top </w:t>
+      </w:r>
+      <w:r>
+        <w:rPr>
+          <w:b/>
+          <w:bCs/>
+          <w:sz w:val="28"/>
+          <w:szCs w:val="28"/>
+        </w:rPr>
+        <w:t xml:space="preserve">10 </w:t>
+      </w:r>
+      <w:r>
+        <w:rPr>
+          <w:b/>
+          <w:bCs/>
+          <w:sz w:val="28"/>
+          <w:szCs w:val="28"/>
+        </w:rPr>
+        <w:t>ranked project picks</w:t>
+      </w:r>
+      <w:r>
+        <w:rPr>
+          <w:b/>
+          <w:bCs/>
+          <w:sz w:val="28"/>
+          <w:szCs w:val="28"/>
+        </w:rPr>
+        <w:t xml:space="preserve"> (</w:t>
+      </w:r>
+      <w:r>
+        <w:rPr>
+          <w:b/>
+          <w:bCs/>
+          <w:sz w:val="28"/>
+          <w:szCs w:val="28"/>
+        </w:rPr>
+        <w:t>only 9 projects, excluding ours, gave a presentatio</w:t>
+      </w:r>
+      <w:r>
+        <w:rPr>
+          <w:b/>
+          <w:bCs/>
+          <w:sz w:val="28"/>
+          <w:szCs w:val="28"/>
+        </w:rPr>
+        <w:t>n) :</w:t>
+      </w:r>
+    </w:p>
+    <w:p>
+      <w:pPr>
+        <w:jc w:val="right"/>
+        <w:rPr>
+          <w:sz w:val="24"/>
+          <w:szCs w:val="24"/>
+        </w:rPr>
+      </w:pPr>
+    </w:p>
+    <w:p>
+      <w:pPr>
+        <w:pStyle w:val="a9"/>
+        <w:numPr>
+          <w:ilvl w:val="0"/>
+          <w:numId w:val="1"/>
+        </w:numPr>
+        <w:rPr>
+          <w:sz w:val="24"/>
+          <w:szCs w:val="24"/>
+        </w:rPr>
+      </w:pPr>
+      <w:r>
+        <w:rPr>
+          <w:sz w:val="24"/>
+          <w:szCs w:val="24"/>
+          <w:rtl/>
+        </w:rPr>
+        <w:t xml:space="preserve">שם המערכת: </w:t>
+      </w:r>
+      <w:r>
+        <w:rPr>
+          <w:sz w:val="24"/>
+          <w:szCs w:val="24"/>
+        </w:rPr>
+        <w:t>LOST &amp; PAWND</w:t>
+      </w:r>
+      <w:r>
+        <w:rPr>
+          <w:sz w:val="24"/>
+          <w:szCs w:val="24"/>
+          <w:rtl/>
+        </w:rPr>
+        <w:t xml:space="preserve"> מערכת לאיתור בעלי חיים שנאבדו</w:t>
+      </w:r>
+    </w:p>
+    <w:p>
+      <w:pPr>
+        <w:rPr>
+          <w:sz w:val="24"/>
+          <w:szCs w:val="24"/>
+          <w:rtl/>
+        </w:rPr>
+      </w:pPr>
       <w:r>
         <w:rPr>
           <w:rFonts w:hint="cs"/>
-          <w:rtl/>
-        </w:rPr>
-        <w:t xml:space="preserve"> יתרון של הדאטה מנגר שהוא מודולרי ויום אחד אפשר להשתמש ב</w:t>
-      </w:r>
-      <w:r>
-        <w:t>firebase</w:t>
-      </w:r>
+          <w:sz w:val="24"/>
+          <w:szCs w:val="24"/>
+          <w:rtl/>
+        </w:rPr>
+        <w:t xml:space="preserve">           </w:t>
+      </w:r>
+      <w:r>
+        <w:rPr>
+          <w:sz w:val="24"/>
+          <w:szCs w:val="24"/>
+          <w:rtl/>
+        </w:rPr>
+        <w:t>שמות המגישים: גל אלפנדרי ולינה פלאט</w:t>
+      </w:r>
+    </w:p>
+    <w:p>
+      <w:pPr>
+        <w:jc w:val="right"/>
+        <w:rPr>
+          <w:sz w:val="24"/>
+          <w:szCs w:val="24"/>
+        </w:rPr>
+      </w:pPr>
+      <w:r>
+        <w:rPr>
+          <w:sz w:val="24"/>
+          <w:szCs w:val="24"/>
+          <w:rtl/>
+        </w:rPr>
+        <w:tab/>
+      </w:r>
+      <w:r>
+        <w:rPr>
+          <w:sz w:val="24"/>
+          <w:szCs w:val="24"/>
+        </w:rPr>
+        <w:t>The progress made in this project is very noticeable. The UI is very advanced and user-friendly. Model is not yet robust, but some features are already working. Another merit is the good cause ,trying to help lost pets to find their owners.</w:t>
+      </w:r>
+    </w:p>
+    <w:p>
+      <w:pPr>
+        <w:pStyle w:val="a9"/>
+        <w:numPr>
+          <w:ilvl w:val="0"/>
+          <w:numId w:val="1"/>
+        </w:numPr>
+        <w:rPr>
+          <w:sz w:val="24"/>
+          <w:szCs w:val="24"/>
+        </w:rPr>
+      </w:pPr>
+      <w:r>
+        <w:rPr>
+          <w:sz w:val="24"/>
+          <w:szCs w:val="24"/>
+          <w:rtl/>
+        </w:rPr>
+        <w:t xml:space="preserve">שם המערכת: </w:t>
+      </w:r>
+      <w:r>
+        <w:rPr>
+          <w:sz w:val="24"/>
+          <w:szCs w:val="24"/>
+        </w:rPr>
+        <w:t>PazHelper</w:t>
+      </w:r>
+      <w:r>
+        <w:rPr>
+          <w:sz w:val="24"/>
+          <w:szCs w:val="24"/>
+          <w:rtl/>
+        </w:rPr>
+        <w:t xml:space="preserve"> </w:t>
+      </w:r>
+    </w:p>
+    <w:p>
+      <w:pPr>
+        <w:rPr>
+          <w:sz w:val="24"/>
+          <w:szCs w:val="24"/>
+          <w:rtl/>
+        </w:rPr>
+      </w:pPr>
       <w:r>
         <w:rPr>
           <w:rFonts w:hint="cs"/>
-          <w:rtl/>
-        </w:rPr>
-        <w:t xml:space="preserve"> ומחר אפשר להשתמש ב</w:t>
-      </w:r>
-      <w:r>
-        <w:t>SQL</w:t>
-      </w:r>
-    </w:p>
-    <w:p>
-      <w:pPr>
-        <w:rPr>
-          <w:rtl/>
-        </w:rPr>
-      </w:pPr>
+          <w:sz w:val="24"/>
+          <w:szCs w:val="24"/>
+          <w:rtl/>
+        </w:rPr>
+        <w:t xml:space="preserve">           </w:t>
+      </w:r>
+      <w:r>
+        <w:rPr>
+          <w:sz w:val="24"/>
+          <w:szCs w:val="24"/>
+          <w:rtl/>
+        </w:rPr>
+        <w:t xml:space="preserve">שמות המגישים: </w:t>
+      </w:r>
       <w:r>
         <w:rPr>
           <w:rFonts w:hint="cs"/>
-          <w:rtl/>
-        </w:rPr>
-        <w:t xml:space="preserve">ליגלינק (שי </w:t>
+          <w:sz w:val="24"/>
+          <w:szCs w:val="24"/>
+          <w:rtl/>
+        </w:rPr>
+        <w:t>יוחאי ורפאל</w:t>
+      </w:r>
+    </w:p>
+    <w:p>
+      <w:pPr>
+        <w:jc w:val="right"/>
+        <w:rPr>
+          <w:sz w:val="24"/>
+          <w:szCs w:val="24"/>
+        </w:rPr>
+      </w:pPr>
+      <w:r>
+        <w:rPr>
+          <w:sz w:val="24"/>
+          <w:szCs w:val="24"/>
+        </w:rPr>
+        <w:t>The project looks very good so far and very advanced. They managed to implement a complex algorithm already into their project. The code is clean, concise and understandable. The project's progress aligns with its requirements.</w:t>
+      </w:r>
+    </w:p>
+    <w:p>
+      <w:pPr>
+        <w:rPr>
+          <w:sz w:val="24"/>
+          <w:szCs w:val="24"/>
+        </w:rPr>
+      </w:pPr>
+    </w:p>
+    <w:p>
+      <w:pPr>
+        <w:pStyle w:val="a9"/>
+        <w:numPr>
+          <w:ilvl w:val="0"/>
+          <w:numId w:val="1"/>
+        </w:numPr>
+        <w:rPr>
+          <w:sz w:val="24"/>
+          <w:szCs w:val="24"/>
+        </w:rPr>
+      </w:pPr>
+      <w:r>
+        <w:rPr>
+          <w:sz w:val="24"/>
+          <w:szCs w:val="24"/>
+          <w:rtl/>
+        </w:rPr>
+        <w:t xml:space="preserve">שם המערכת: </w:t>
       </w:r>
       <w:r>
         <w:rPr>
           <w:rFonts w:hint="cs"/>
-          <w:rtl/>
-        </w:rPr>
-        <w:t>ועידו</w:t>
-      </w:r>
+          <w:sz w:val="24"/>
+          <w:szCs w:val="24"/>
+          <w:rtl/>
+        </w:rPr>
+        <w:t>מערכת עבור טיולי שטח</w:t>
+      </w:r>
+    </w:p>
+    <w:p>
+      <w:pPr>
+        <w:rPr>
+          <w:sz w:val="24"/>
+          <w:szCs w:val="24"/>
+          <w:rtl/>
+        </w:rPr>
+      </w:pPr>
       <w:r>
         <w:rPr>
           <w:rFonts w:hint="cs"/>
-          <w:rtl/>
-        </w:rPr>
-        <w:t xml:space="preserve">) </w:t>
-      </w:r>
-      <w:r>
-        <w:rPr>
-          <w:rtl/>
-        </w:rPr>
-        <w:t>–</w:t>
+          <w:sz w:val="24"/>
+          <w:szCs w:val="24"/>
+          <w:rtl/>
+        </w:rPr>
+        <w:t xml:space="preserve">           </w:t>
+      </w:r>
+      <w:r>
+        <w:rPr>
+          <w:sz w:val="24"/>
+          <w:szCs w:val="24"/>
+          <w:rtl/>
+        </w:rPr>
+        <w:t xml:space="preserve">שמות המגישים: </w:t>
       </w:r>
       <w:r>
         <w:rPr>
           <w:rFonts w:hint="cs"/>
+          <w:sz w:val="24"/>
+          <w:szCs w:val="24"/>
+          <w:rtl/>
+        </w:rPr>
+        <w:t>שי עודני ודניאל בצלאל</w:t>
+      </w:r>
+    </w:p>
+    <w:p>
+      <w:pPr>
+        <w:jc w:val="right"/>
+        <w:rPr>
+          <w:sz w:val="24"/>
+          <w:szCs w:val="24"/>
+        </w:rPr>
+      </w:pPr>
+      <w:r>
+        <w:rPr>
+          <w:sz w:val="24"/>
+          <w:szCs w:val="24"/>
+        </w:rPr>
+        <w:t xml:space="preserve">Despite being at a relative beginning point in their roadmap , the project's purpose and its boundaries are clearly documented. There's </w:t>
+      </w:r>
+      <w:r>
+        <w:rPr>
+          <w:sz w:val="24"/>
+          <w:szCs w:val="24"/>
+        </w:rPr>
+        <w:t>a distinct workload distribution which is likely to make the progress more efficiently.</w:t>
+      </w:r>
+    </w:p>
+    <w:p>
+      <w:pPr>
+        <w:jc w:val="right"/>
+        <w:rPr>
+          <w:sz w:val="24"/>
+          <w:szCs w:val="24"/>
+          <w:rtl/>
+        </w:rPr>
+      </w:pPr>
+    </w:p>
+    <w:p>
+      <w:pPr>
+        <w:pStyle w:val="a9"/>
+        <w:numPr>
+          <w:ilvl w:val="0"/>
+          <w:numId w:val="1"/>
+        </w:numPr>
+        <w:rPr>
+          <w:sz w:val="24"/>
+          <w:szCs w:val="24"/>
+        </w:rPr>
+      </w:pPr>
+      <w:r>
+        <w:rPr>
+          <w:sz w:val="24"/>
+          <w:szCs w:val="24"/>
+          <w:rtl/>
+        </w:rPr>
+        <w:t xml:space="preserve">שם המערכת: </w:t>
+      </w:r>
+      <w:r>
+        <w:rPr>
+          <w:sz w:val="24"/>
+          <w:szCs w:val="24"/>
+        </w:rPr>
+        <w:t>Apex</w:t>
+      </w:r>
+    </w:p>
+    <w:p>
+      <w:pPr>
+        <w:rPr>
+          <w:sz w:val="24"/>
+          <w:szCs w:val="24"/>
+          <w:rtl/>
+        </w:rPr>
+      </w:pPr>
+      <w:r>
+        <w:rPr>
+          <w:rFonts w:hint="cs"/>
+          <w:sz w:val="24"/>
+          <w:szCs w:val="24"/>
+          <w:rtl/>
+        </w:rPr>
+        <w:t xml:space="preserve">           </w:t>
+      </w:r>
+      <w:r>
+        <w:rPr>
+          <w:sz w:val="24"/>
+          <w:szCs w:val="24"/>
+          <w:rtl/>
+        </w:rPr>
+        <w:t xml:space="preserve">שמות המגישים: </w:t>
+      </w:r>
+      <w:r>
+        <w:rPr>
+          <w:rFonts w:hint="cs"/>
+          <w:sz w:val="24"/>
+          <w:szCs w:val="24"/>
+          <w:rtl/>
+        </w:rPr>
+        <w:t xml:space="preserve">עומרי </w:t>
+      </w:r>
+      <w:proofErr w:type="spellStart"/>
+      <w:r>
+        <w:rPr>
+          <w:rFonts w:hint="cs"/>
+          <w:sz w:val="24"/>
+          <w:szCs w:val="24"/>
+          <w:rtl/>
+        </w:rPr>
+        <w:t>רוטר</w:t>
+      </w:r>
+      <w:proofErr w:type="spellEnd"/>
+      <w:r>
+        <w:rPr>
+          <w:rFonts w:hint="cs"/>
+          <w:sz w:val="24"/>
+          <w:szCs w:val="24"/>
+          <w:rtl/>
+        </w:rPr>
+        <w:t>, ניב בוסקילה ואמיתי מנור</w:t>
+      </w:r>
+    </w:p>
+    <w:p>
+      <w:pPr>
+        <w:jc w:val="right"/>
+        <w:rPr>
+          <w:sz w:val="24"/>
+          <w:szCs w:val="24"/>
+          <w:rtl/>
+        </w:rPr>
+      </w:pPr>
+      <w:r>
+        <w:rPr>
+          <w:sz w:val="24"/>
+          <w:szCs w:val="24"/>
+        </w:rPr>
+        <w:t xml:space="preserve">The project has made a decent progress and starts taking shape. The architecture seems modular to satisfy the obligations. Their daily task allocation </w:t>
+      </w:r>
+      <w:r>
+        <w:rPr>
+          <w:sz w:val="24"/>
+          <w:szCs w:val="24"/>
+        </w:rPr>
+        <w:t>is noteworthy.</w:t>
+      </w:r>
+      <w:r>
+        <w:rPr>
+          <w:rFonts w:hint="cs"/>
+          <w:sz w:val="24"/>
+          <w:szCs w:val="24"/>
           <w:rtl/>
         </w:rPr>
         <w:t xml:space="preserve"> </w:t>
       </w:r>
+    </w:p>
+    <w:p>
+      <w:pPr>
+        <w:jc w:val="right"/>
+        <w:rPr>
+          <w:sz w:val="24"/>
+          <w:szCs w:val="24"/>
+          <w:rtl/>
+        </w:rPr>
+      </w:pPr>
+    </w:p>
+    <w:p>
+      <w:pPr>
+        <w:pStyle w:val="a9"/>
+        <w:numPr>
+          <w:ilvl w:val="0"/>
+          <w:numId w:val="2"/>
+        </w:numPr>
+        <w:rPr>
+          <w:sz w:val="24"/>
+          <w:szCs w:val="24"/>
+        </w:rPr>
+      </w:pPr>
+      <w:r>
+        <w:rPr>
+          <w:sz w:val="24"/>
+          <w:szCs w:val="24"/>
+          <w:rtl/>
+        </w:rPr>
+        <w:lastRenderedPageBreak/>
+        <w:t>שם המערכת: מערכת לחיפוש קעקועים/מקעקעים</w:t>
+      </w:r>
+    </w:p>
+    <w:p>
+      <w:pPr>
+        <w:rPr>
+          <w:sz w:val="24"/>
+          <w:szCs w:val="24"/>
+          <w:rtl/>
+        </w:rPr>
+      </w:pPr>
       <w:r>
         <w:rPr>
           <w:rFonts w:hint="cs"/>
-          <w:rtl/>
-        </w:rPr>
-        <w:t>אפליקצייה ליצירת תחרויות , נמצאים ב</w:t>
-      </w:r>
+          <w:sz w:val="24"/>
+          <w:szCs w:val="24"/>
+          <w:rtl/>
+        </w:rPr>
+        <w:t xml:space="preserve">           </w:t>
+      </w:r>
+      <w:r>
+        <w:rPr>
+          <w:sz w:val="24"/>
+          <w:szCs w:val="24"/>
+          <w:rtl/>
+        </w:rPr>
+        <w:t>שמות המגישים: ליאור טולדנו ועידו בשארי</w:t>
+      </w:r>
+    </w:p>
+    <w:p>
+      <w:pPr>
+        <w:jc w:val="right"/>
+        <w:rPr>
+          <w:sz w:val="24"/>
+          <w:szCs w:val="24"/>
+          <w:rtl/>
+        </w:rPr>
+      </w:pPr>
+      <w:r>
+        <w:rPr>
+          <w:sz w:val="24"/>
+          <w:szCs w:val="24"/>
+        </w:rPr>
+        <w:t>The website design looks great, and they made a nice use of Gemini filtering certain tags of existing pictures that can be uploaded to their platform. The algorithm of obtaining tags from pictures or prompts is outstanding too.</w:t>
+      </w:r>
+    </w:p>
+    <w:p>
+      <w:pPr>
+        <w:jc w:val="right"/>
+        <w:rPr>
+          <w:sz w:val="24"/>
+          <w:szCs w:val="24"/>
+        </w:rPr>
+      </w:pPr>
+    </w:p>
+    <w:p>
+      <w:pPr>
+        <w:pStyle w:val="a9"/>
+        <w:numPr>
+          <w:ilvl w:val="0"/>
+          <w:numId w:val="2"/>
+        </w:numPr>
+        <w:rPr>
+          <w:sz w:val="24"/>
+          <w:szCs w:val="24"/>
+        </w:rPr>
+      </w:pPr>
+      <w:r>
+        <w:rPr>
+          <w:sz w:val="24"/>
+          <w:szCs w:val="24"/>
+          <w:rtl/>
+        </w:rPr>
+        <w:t xml:space="preserve">שם המערכת: </w:t>
+      </w:r>
+      <w:proofErr w:type="spellStart"/>
+      <w:r>
+        <w:rPr>
+          <w:sz w:val="24"/>
+          <w:szCs w:val="24"/>
+        </w:rPr>
+        <w:t>LeagueLink</w:t>
+      </w:r>
+      <w:proofErr w:type="spellEnd"/>
+    </w:p>
+    <w:p>
+      <w:pPr>
+        <w:rPr>
+          <w:sz w:val="24"/>
+          <w:szCs w:val="24"/>
+          <w:rtl/>
+        </w:rPr>
+      </w:pPr>
       <w:r>
         <w:rPr>
           <w:rFonts w:hint="cs"/>
+          <w:sz w:val="24"/>
+          <w:szCs w:val="24"/>
+          <w:rtl/>
+        </w:rPr>
+        <w:t xml:space="preserve">           </w:t>
+      </w:r>
+      <w:r>
+        <w:rPr>
+          <w:sz w:val="24"/>
+          <w:szCs w:val="24"/>
+          <w:rtl/>
+        </w:rPr>
+        <w:t xml:space="preserve">שמות המגישים: </w:t>
+      </w:r>
+      <w:r>
+        <w:rPr>
+          <w:rFonts w:hint="cs"/>
+          <w:sz w:val="24"/>
+          <w:szCs w:val="24"/>
+          <w:rtl/>
+        </w:rPr>
+        <w:t>שי ועידו</w:t>
+      </w:r>
+    </w:p>
+    <w:p>
+      <w:pPr>
+        <w:jc w:val="right"/>
+        <w:rPr>
+          <w:sz w:val="24"/>
+          <w:szCs w:val="24"/>
+        </w:rPr>
+      </w:pPr>
+      <w:r>
+        <w:rPr>
+          <w:sz w:val="24"/>
+          <w:szCs w:val="24"/>
+        </w:rPr>
+        <w:t>The project is at a relatively advanced point and well structured</w:t>
+      </w:r>
+      <w:r>
+        <w:rPr>
+          <w:sz w:val="24"/>
+          <w:szCs w:val="24"/>
+        </w:rPr>
+        <w:t xml:space="preserve"> in terms of adding users , UI implementation and integration between Firebase and the system itself and its database.</w:t>
+      </w:r>
+    </w:p>
+    <w:p>
+      <w:pPr>
+        <w:jc w:val="right"/>
+        <w:rPr>
+          <w:sz w:val="24"/>
+          <w:szCs w:val="24"/>
+        </w:rPr>
+      </w:pPr>
+    </w:p>
+    <w:p>
+      <w:pPr>
+        <w:pStyle w:val="a9"/>
+        <w:numPr>
+          <w:ilvl w:val="0"/>
+          <w:numId w:val="2"/>
+        </w:numPr>
+        <w:rPr>
+          <w:sz w:val="24"/>
+          <w:szCs w:val="24"/>
+        </w:rPr>
+      </w:pPr>
+      <w:r>
+        <w:rPr>
+          <w:sz w:val="24"/>
+          <w:szCs w:val="24"/>
+          <w:rtl/>
+        </w:rPr>
+        <w:t xml:space="preserve">שם המערכת: </w:t>
+      </w:r>
+      <w:proofErr w:type="spellStart"/>
+      <w:r>
+        <w:rPr>
+          <w:sz w:val="24"/>
+          <w:szCs w:val="24"/>
+        </w:rPr>
+        <w:t>PuzzLink</w:t>
+      </w:r>
+      <w:proofErr w:type="spellEnd"/>
+    </w:p>
+    <w:p>
+      <w:pPr>
+        <w:rPr>
+          <w:sz w:val="24"/>
+          <w:szCs w:val="24"/>
+          <w:rtl/>
+        </w:rPr>
+      </w:pPr>
+      <w:r>
+        <w:rPr>
+          <w:rFonts w:hint="cs"/>
+          <w:sz w:val="24"/>
+          <w:szCs w:val="24"/>
+          <w:rtl/>
+        </w:rPr>
+        <w:t xml:space="preserve">           </w:t>
+      </w:r>
+      <w:r>
+        <w:rPr>
+          <w:sz w:val="24"/>
+          <w:szCs w:val="24"/>
+          <w:rtl/>
+        </w:rPr>
+        <w:t xml:space="preserve">שמות המגישים: </w:t>
+      </w:r>
+      <w:r>
+        <w:rPr>
+          <w:rFonts w:hint="cs"/>
+          <w:sz w:val="24"/>
+          <w:szCs w:val="24"/>
+          <w:rtl/>
+        </w:rPr>
+        <w:t>שירן רייך ועדי ורד</w:t>
+      </w:r>
+    </w:p>
+    <w:p>
+      <w:pPr>
+        <w:jc w:val="right"/>
+        <w:rPr>
+          <w:sz w:val="24"/>
+          <w:szCs w:val="24"/>
+          <w:rtl/>
+        </w:rPr>
+      </w:pPr>
+      <w:r>
+        <w:rPr>
+          <w:sz w:val="24"/>
+          <w:szCs w:val="24"/>
+        </w:rPr>
+        <w:t>Nice and intuitive UI design. It seems they made a decent way, but still a long way to go. The system can create games between users , where the goal is to solve a puzzle.  They also implemented a nice feature allowing to upload an image that will be rendered later into a puzzle. Their chat box is a nice add-on.</w:t>
+      </w:r>
+    </w:p>
+    <w:p>
+      <w:pPr>
+        <w:jc w:val="right"/>
+        <w:rPr>
+          <w:sz w:val="24"/>
+          <w:szCs w:val="24"/>
+        </w:rPr>
+      </w:pPr>
+    </w:p>
+    <w:p>
+      <w:pPr>
+        <w:pStyle w:val="a9"/>
+        <w:numPr>
+          <w:ilvl w:val="0"/>
+          <w:numId w:val="1"/>
+        </w:numPr>
+        <w:rPr>
+          <w:sz w:val="24"/>
+          <w:szCs w:val="24"/>
+        </w:rPr>
+      </w:pPr>
+      <w:r>
+        <w:rPr>
+          <w:sz w:val="24"/>
+          <w:szCs w:val="24"/>
+          <w:rtl/>
+        </w:rPr>
+        <w:t xml:space="preserve">שם המערכת: מערכת </w:t>
+      </w:r>
+      <w:r>
+        <w:rPr>
+          <w:rFonts w:hint="cs"/>
+          <w:sz w:val="24"/>
+          <w:szCs w:val="24"/>
+          <w:rtl/>
+        </w:rPr>
+        <w:t>חכמה לניהול קניות</w:t>
+      </w:r>
+    </w:p>
+    <w:p>
+      <w:pPr>
+        <w:rPr>
+          <w:sz w:val="24"/>
+          <w:szCs w:val="24"/>
+          <w:rtl/>
+        </w:rPr>
+      </w:pPr>
+      <w:r>
+        <w:rPr>
+          <w:rFonts w:hint="cs"/>
+          <w:sz w:val="24"/>
+          <w:szCs w:val="24"/>
+          <w:rtl/>
+        </w:rPr>
+        <w:t xml:space="preserve">           </w:t>
+      </w:r>
+      <w:r>
+        <w:rPr>
+          <w:sz w:val="24"/>
+          <w:szCs w:val="24"/>
+          <w:rtl/>
+        </w:rPr>
+        <w:t xml:space="preserve">שמות המגישים: </w:t>
+      </w:r>
+      <w:r>
+        <w:rPr>
+          <w:rFonts w:hint="cs"/>
+          <w:sz w:val="24"/>
+          <w:szCs w:val="24"/>
           <w:rtl/>
         </w:rPr>
         <w:t>ש</w:t>
@@ -94,402 +929,153 @@
       <w:r>
         <w:rPr>
           <w:rFonts w:hint="cs"/>
-          <w:rtl/>
-        </w:rPr>
-        <w:t>לב מתקדם מבחינת הוספת משתמשים, חווית משתמש וחיבור ומימשוק בין ה</w:t>
-      </w:r>
-      <w:r>
-        <w:t>firebase</w:t>
-      </w:r>
-      <w:r>
+          <w:sz w:val="24"/>
+          <w:szCs w:val="24"/>
+          <w:rtl/>
+        </w:rPr>
+        <w:t>לומי, ליעד ובן</w:t>
+      </w:r>
+    </w:p>
+    <w:p>
+      <w:pPr>
+        <w:jc w:val="right"/>
+        <w:rPr>
+          <w:sz w:val="24"/>
+          <w:szCs w:val="24"/>
+        </w:rPr>
+      </w:pPr>
+      <w:r>
+        <w:rPr>
+          <w:sz w:val="24"/>
+          <w:szCs w:val="24"/>
+        </w:rPr>
+        <w:t>The UI isn't updated regarding the database connection</w:t>
+      </w:r>
+      <w:r>
+        <w:rPr>
+          <w:sz w:val="24"/>
+          <w:szCs w:val="24"/>
+        </w:rPr>
+        <w:t>. The calls from shopping websites and the algorithm have not yet been implemented in their code.</w:t>
+      </w:r>
+    </w:p>
+    <w:p>
+      <w:pPr>
         <w:rPr>
           <w:rFonts w:hint="cs"/>
-          <w:rtl/>
-        </w:rPr>
-        <w:t xml:space="preserve"> ל-</w:t>
-      </w:r>
-      <w:r>
-        <w:t>database</w:t>
+          <w:sz w:val="24"/>
+          <w:szCs w:val="24"/>
+        </w:rPr>
+      </w:pPr>
+    </w:p>
+    <w:p>
+      <w:pPr>
+        <w:pStyle w:val="a9"/>
+        <w:numPr>
+          <w:ilvl w:val="0"/>
+          <w:numId w:val="1"/>
+        </w:numPr>
+        <w:rPr>
+          <w:sz w:val="24"/>
+          <w:szCs w:val="24"/>
+        </w:rPr>
+      </w:pPr>
+      <w:r>
+        <w:rPr>
+          <w:sz w:val="24"/>
+          <w:szCs w:val="24"/>
+          <w:rtl/>
+        </w:rPr>
+        <w:t xml:space="preserve">שם המערכת: מערכת </w:t>
       </w:r>
       <w:r>
         <w:rPr>
           <w:rFonts w:hint="cs"/>
-          <w:rtl/>
-        </w:rPr>
-        <w:t xml:space="preserve"> ולמערכת עצמה.</w:t>
-      </w:r>
-    </w:p>
-    <w:p>
-      <w:pPr>
-        <w:rPr>
+          <w:sz w:val="24"/>
+          <w:szCs w:val="24"/>
+          <w:rtl/>
+        </w:rPr>
+        <w:t>חכמה לניהול זמן</w:t>
+      </w:r>
+    </w:p>
+    <w:p>
+      <w:pPr>
+        <w:rPr>
+          <w:sz w:val="24"/>
+          <w:szCs w:val="24"/>
           <w:rtl/>
         </w:rPr>
       </w:pPr>
       <w:r>
         <w:rPr>
           <w:rFonts w:hint="cs"/>
-          <w:rtl/>
-        </w:rPr>
-        <w:t>יוחאי ורפאל (</w:t>
-      </w:r>
-      <w:r>
-        <w:t>PazHelper</w:t>
+          <w:sz w:val="24"/>
+          <w:szCs w:val="24"/>
+          <w:rtl/>
+        </w:rPr>
+        <w:t xml:space="preserve">           </w:t>
+      </w:r>
+      <w:r>
+        <w:rPr>
+          <w:sz w:val="24"/>
+          <w:szCs w:val="24"/>
+          <w:rtl/>
+        </w:rPr>
+        <w:t xml:space="preserve">שמות המגישים: </w:t>
       </w:r>
       <w:r>
         <w:rPr>
           <w:rFonts w:hint="cs"/>
-          <w:rtl/>
-        </w:rPr>
-        <w:t xml:space="preserve">) </w:t>
-      </w:r>
-      <w:r>
-        <w:rPr>
-          <w:rtl/>
-        </w:rPr>
-        <w:t>–</w:t>
-      </w:r>
-      <w:r>
-        <w:rPr>
-          <w:rFonts w:hint="cs"/>
-          <w:rtl/>
-        </w:rPr>
-        <w:t xml:space="preserve"> מערכת למיון חלקי פאזל. המערכת מצליחה לסווג את סוגי החלקים לפי בליטות ושקעים. </w:t>
-      </w:r>
-      <w:r>
-        <w:rPr>
-          <w:rFonts w:hint="cs"/>
-          <w:rtl/>
-        </w:rPr>
-        <w:t xml:space="preserve">רעיון ממש יפה והתקדמות טובה גם במערכת עצמה. המערכת כבר מחזירה התאמה לפי צבע של החלק לחלק המתאים בתמונה. </w:t>
-      </w:r>
-    </w:p>
-    <w:p>
-      <w:pPr>
-        <w:rPr>
-          <w:rtl/>
-        </w:rPr>
-      </w:pPr>
-      <w:r>
-        <w:rPr>
-          <w:rFonts w:hint="cs"/>
-          <w:rtl/>
-        </w:rPr>
-        <w:t xml:space="preserve">מיכאל ודור </w:t>
-      </w:r>
-      <w:r>
-        <w:rPr>
-          <w:rtl/>
-        </w:rPr>
-        <w:t>–</w:t>
-      </w:r>
-      <w:r>
-        <w:rPr>
-          <w:rFonts w:hint="cs"/>
-          <w:rtl/>
-        </w:rPr>
-        <w:t xml:space="preserve"> </w:t>
-      </w:r>
-    </w:p>
-    <w:p>
-      <w:pPr>
-        <w:rPr>
-          <w:rFonts w:hint="cs"/>
-          <w:rtl/>
-        </w:rPr>
-      </w:pPr>
-      <w:r>
-        <w:rPr>
-          <w:rFonts w:hint="cs"/>
-          <w:rtl/>
-        </w:rPr>
-        <w:t xml:space="preserve">גל ולינה </w:t>
-      </w:r>
-      <w:r>
-        <w:rPr>
-          <w:rtl/>
-        </w:rPr>
-        <w:t>–</w:t>
-      </w:r>
-      <w:r>
-        <w:rPr>
-          <w:rFonts w:hint="cs"/>
-          <w:rtl/>
-        </w:rPr>
-        <w:t xml:space="preserve"> התקדמות ממש יפה. </w:t>
-      </w:r>
-      <w:r>
-        <w:t>Ui</w:t>
-      </w:r>
-      <w:r>
-        <w:rPr>
-          <w:rFonts w:hint="cs"/>
-          <w:rtl/>
-        </w:rPr>
-        <w:t xml:space="preserve"> מאוד מתקדם וידידותי למשתמש, המודל עדיין לא מעודכן ולא רץ אבל שאר הפיצ'רים כבר עובדים ונראים מאוד יפה.</w:t>
-      </w:r>
-      <w:r>
-        <w:rPr>
-          <w:rFonts w:hint="cs"/>
-          <w:rtl/>
-        </w:rPr>
-        <w:t xml:space="preserve"> (מערכת למציאת בעלי חיים אבודים </w:t>
-      </w:r>
-      <w:r>
-        <w:rPr>
-          <w:rtl/>
-        </w:rPr>
-        <w:t>–</w:t>
-      </w:r>
-      <w:r>
-        <w:rPr>
-          <w:rFonts w:hint="cs"/>
-          <w:rtl/>
-        </w:rPr>
-        <w:t xml:space="preserve"> סוג של רשת חברתית)</w:t>
-      </w:r>
-    </w:p>
-    <w:p>
-      <w:pPr>
-        <w:rPr>
-          <w:rtl/>
-        </w:rPr>
-      </w:pPr>
-      <w:r>
-        <w:rPr>
-          <w:rFonts w:hint="cs"/>
-          <w:rtl/>
-        </w:rPr>
-        <w:t xml:space="preserve">שלומי, ליעד ובן </w:t>
-      </w:r>
-      <w:r>
-        <w:rPr>
-          <w:rtl/>
-        </w:rPr>
-        <w:t>–</w:t>
-      </w:r>
-      <w:r>
-        <w:rPr>
-          <w:rFonts w:hint="cs"/>
-          <w:rtl/>
-        </w:rPr>
-        <w:t xml:space="preserve"> ה</w:t>
-      </w:r>
-      <w:r>
-        <w:t>UI</w:t>
-      </w:r>
-      <w:r>
-        <w:rPr>
-          <w:rFonts w:hint="cs"/>
-          <w:rtl/>
-        </w:rPr>
-        <w:t xml:space="preserve"> עדיין לא מעודכן מבחינת חיבור לדאטה בייס. הקריאות מהאתרי אינטרנט של אתרי הקניות והאלגוריתם עדיין לא מוטעמים בקוד. יש עוד הרבה עבודה ב</w:t>
-      </w:r>
-      <w:r>
-        <w:t>Backend</w:t>
-      </w:r>
-      <w:r>
-        <w:rPr>
-          <w:rFonts w:hint="cs"/>
-          <w:rtl/>
-        </w:rPr>
-        <w:t>.</w:t>
-      </w:r>
-      <w:r>
-        <w:rPr>
-          <w:rFonts w:hint="cs"/>
-          <w:rtl/>
-        </w:rPr>
-        <w:t xml:space="preserve"> (מערכת שמביאה את סל הקניות הכי טוב)</w:t>
-      </w:r>
-    </w:p>
-    <w:p>
-      <w:pPr>
-        <w:rPr>
-          <w:rtl/>
-        </w:rPr>
-      </w:pPr>
-      <w:r>
-        <w:rPr>
-          <w:rFonts w:hint="cs"/>
-          <w:rtl/>
-        </w:rPr>
-        <w:t xml:space="preserve">ליאור ועידו </w:t>
-      </w:r>
-      <w:r>
-        <w:rPr>
-          <w:rtl/>
-        </w:rPr>
-        <w:t>–</w:t>
-      </w:r>
-      <w:r>
-        <w:rPr>
-          <w:rFonts w:hint="cs"/>
-          <w:rtl/>
-        </w:rPr>
-        <w:t xml:space="preserve"> העיצוב של האתר נראה מאוד טוב, שימוש יפה עם </w:t>
-      </w:r>
-      <w:r>
-        <w:t>gemini</w:t>
-      </w:r>
-      <w:r>
-        <w:rPr>
-          <w:rFonts w:hint="cs"/>
-          <w:rtl/>
-        </w:rPr>
-        <w:t xml:space="preserve"> על מנת לפלטר תגיות מסוימות גם של תמונות קיימות שאפשר להעלות לאתר.</w:t>
-      </w:r>
-      <w:r>
-        <w:rPr>
-          <w:rFonts w:hint="cs"/>
-          <w:rtl/>
-        </w:rPr>
-        <w:t xml:space="preserve"> האלגוריתם של לפלטר תגיות ולהוציא אותן מתוך תמונות קיימות או </w:t>
-      </w:r>
-      <w:r>
-        <w:t>prompt</w:t>
-      </w:r>
-      <w:r>
-        <w:rPr>
-          <w:rFonts w:hint="cs"/>
-          <w:rtl/>
-        </w:rPr>
-        <w:t xml:space="preserve"> מסוים הוא יפה. (מערכת קעקועים)</w:t>
-      </w:r>
-    </w:p>
-    <w:p>
-      <w:pPr>
-        <w:rPr>
-          <w:rtl/>
-        </w:rPr>
-      </w:pPr>
-      <w:r>
-        <w:rPr>
-          <w:rFonts w:hint="cs"/>
-          <w:rtl/>
-        </w:rPr>
-        <w:t>עומרי, ניב ואמיתי (</w:t>
-      </w:r>
-      <w:r>
-        <w:t>APEX</w:t>
-      </w:r>
-      <w:r>
-        <w:rPr>
-          <w:rFonts w:hint="cs"/>
-          <w:rtl/>
-        </w:rPr>
-        <w:t xml:space="preserve">) </w:t>
-      </w:r>
-      <w:r>
-        <w:rPr>
-          <w:rtl/>
-        </w:rPr>
-        <w:t>–</w:t>
-      </w:r>
-      <w:r>
-        <w:rPr>
-          <w:rFonts w:hint="cs"/>
-          <w:rtl/>
-        </w:rPr>
-        <w:t xml:space="preserve"> מערכת של </w:t>
-      </w:r>
-      <w:r>
-        <w:t>ai</w:t>
-      </w:r>
-      <w:r>
-        <w:rPr>
-          <w:rFonts w:hint="cs"/>
-          <w:rtl/>
-        </w:rPr>
-        <w:t xml:space="preserve"> כדי לייעל את החיפוש בכל התקנונים של אפקה. לפי חיפוש מסוים אפשר להוציא תשובה מדויקת מהתקנונים. התשתית מאחורי האלגוריתם יחסית מוכנה אבל המודל עצמו עדיין לא מוכן ולא מחובר </w:t>
-      </w:r>
-      <w:r>
-        <w:rPr>
-          <w:rtl/>
-        </w:rPr>
-        <w:t>–</w:t>
-      </w:r>
-      <w:r>
-        <w:rPr>
-          <w:rFonts w:hint="cs"/>
-          <w:rtl/>
-        </w:rPr>
-        <w:t xml:space="preserve"> זה עיקר המערכת.</w:t>
-      </w:r>
-    </w:p>
-    <w:p>
-      <w:pPr>
-        <w:rPr>
-          <w:rFonts w:hint="cs"/>
-          <w:rtl/>
-        </w:rPr>
-      </w:pPr>
-      <w:r>
-        <w:rPr>
-          <w:rFonts w:hint="cs"/>
-          <w:rtl/>
-        </w:rPr>
-        <w:t xml:space="preserve">שירן רייך ועדי ורד </w:t>
-      </w:r>
-      <w:r>
-        <w:rPr>
-          <w:rtl/>
-        </w:rPr>
-        <w:t>–</w:t>
-      </w:r>
-      <w:r>
-        <w:rPr>
-          <w:rFonts w:hint="cs"/>
-          <w:rtl/>
-        </w:rPr>
-        <w:t xml:space="preserve"> מערכת ליצירת פאזלים (</w:t>
-      </w:r>
-      <w:r>
-        <w:t>PuzzLink</w:t>
-      </w:r>
-      <w:r>
-        <w:rPr>
-          <w:rFonts w:hint="cs"/>
-          <w:rtl/>
-        </w:rPr>
-        <w:t xml:space="preserve">). המערכת גם יכולה ליצור משחקים בין משתמשים. המשחק הוא פתירת פאזל, אפשר גם בתורות. האפשר להעלות למערכת תמונה והיא מייצרת פאזל או באמצעות </w:t>
-      </w:r>
-      <w:r>
-        <w:t>ai</w:t>
-      </w:r>
-      <w:r>
-        <w:rPr>
-          <w:rFonts w:hint="cs"/>
-          <w:rtl/>
-        </w:rPr>
-        <w:t xml:space="preserve"> עם </w:t>
-      </w:r>
-      <w:r>
-        <w:t>prompt</w:t>
-      </w:r>
-      <w:r>
-        <w:rPr>
-          <w:rFonts w:hint="cs"/>
-          <w:rtl/>
-        </w:rPr>
-        <w:t>.</w:t>
-      </w:r>
-      <w:r>
-        <w:rPr>
-          <w:rFonts w:hint="cs"/>
-          <w:rtl/>
-        </w:rPr>
-        <w:t xml:space="preserve"> עיצוב </w:t>
-      </w:r>
-      <w:r>
-        <w:t>ui</w:t>
-      </w:r>
-      <w:r>
-        <w:rPr>
-          <w:rFonts w:hint="cs"/>
-          <w:rtl/>
-        </w:rPr>
-        <w:t xml:space="preserve"> יפה ואינטואיטיבי. יש גם צ'אט נחמד במשחק עצמו.</w:t>
-      </w:r>
+          <w:sz w:val="24"/>
+          <w:szCs w:val="24"/>
+          <w:rtl/>
+        </w:rPr>
+        <w:t>מיכאל ודור</w:t>
+      </w:r>
+    </w:p>
+    <w:p>
+      <w:pPr>
+        <w:jc w:val="right"/>
+        <w:rPr>
+          <w:sz w:val="24"/>
+          <w:szCs w:val="24"/>
+        </w:rPr>
+      </w:pPr>
+      <w:r>
+        <w:rPr>
+          <w:sz w:val="24"/>
+          <w:szCs w:val="24"/>
+        </w:rPr>
+        <w:t>They made a nice improvement when it comes to the front-end. Their back-hand development still lags behind.</w:t>
+      </w:r>
+    </w:p>
+    <w:p>
+      <w:pPr>
+        <w:jc w:val="right"/>
+        <w:rPr>
+          <w:sz w:val="24"/>
+          <w:szCs w:val="24"/>
+          <w:rtl/>
+        </w:rPr>
+      </w:pPr>
+    </w:p>
+    <w:p>
+      <w:pPr>
+        <w:jc w:val="right"/>
+        <w:rPr>
+          <w:sz w:val="24"/>
+          <w:szCs w:val="24"/>
+        </w:rPr>
+      </w:pPr>
+    </w:p>
+    <w:p>
+      <w:pPr>
+        <w:jc w:val="right"/>
+        <w:rPr>
+          <w:sz w:val="24"/>
+          <w:szCs w:val="24"/>
+        </w:rPr>
+      </w:pPr>
     </w:p>
     <w:sectPr>
       <w:pgSz w:w="11906" w:h="16838"/>
@@ -503,6 +1089,242 @@
 </w:document>
 </file>
 
+<file path=word/numbering.xml><?xml version="1.0" encoding="utf-8"?>
+<w:numbering xmlns:wpc="http://schemas.microsoft.com/office/word/2010/wordprocessingCanvas" xmlns:cx="http://schemas.microsoft.com/office/drawing/2014/chartex" xmlns:cx1="http://schemas.microsoft.com/office/drawing/2015/9/8/chartex" xmlns:cx2="http://schemas.microsoft.com/office/drawing/2015/10/21/chartex" xmlns:cx3="http://schemas.microsoft.com/office/drawing/2016/5/9/chartex" xmlns:cx4="http://schemas.microsoft.com/office/drawing/2016/5/10/chartex" xmlns:cx5="http://schemas.microsoft.com/office/drawing/2016/5/11/chartex" xmlns:cx6="http://schemas.microsoft.com/office/drawing/2016/5/12/chartex" xmlns:cx7="http://schemas.microsoft.com/office/drawing/2016/5/13/chartex" xmlns:cx8="http://schemas.microsoft.com/office/drawing/2016/5/14/chartex" xmlns:mc="http://schemas.openxmlformats.org/markup-compatibility/2006" xmlns:aink="http://schemas.microsoft.com/office/drawing/2016/ink" xmlns:am3d="http://schemas.microsoft.com/office/drawing/2017/model3d" xmlns:o="urn:schemas-microsoft-com:office:office" xmlns:oel="http://schemas.microsoft.com/office/2019/extlst" xmlns:r="http://schemas.openxmlformats.org/officeDocument/2006/relationships" xmlns:m="http://schemas.openxmlformats.org/officeDocument/2006/math" xmlns:v="urn:schemas-microsoft-com:vml" xmlns:wp14="http://schemas.microsoft.com/office/word/2010/wordprocessingDrawing" xmlns:wp="http://schemas.openxmlformats.org/drawingml/2006/wordprocessingDrawing" xmlns:w10="urn:schemas-microsoft-com:office:word" xmlns:w="http://schemas.openxmlformats.org/wordprocessingml/2006/main" xmlns:w14="http://schemas.microsoft.com/office/word/2010/wordml" xmlns:w15="http://schemas.microsoft.com/office/word/2012/wordml" xmlns:w16cex="http://schemas.microsoft.com/office/word/2018/wordml/cex" xmlns:w16cid="http://schemas.microsoft.com/office/word/2016/wordml/cid" xmlns:w16="http://schemas.microsoft.com/office/word/2018/wordml" xmlns:w16du="http://schemas.microsoft.com/office/word/2023/wordml/word16du" xmlns:w16sdtdh="http://schemas.microsoft.com/office/word/2020/wordml/sdtdatahash" xmlns:w16sdtfl="http://schemas.microsoft.com/office/word/2024/wordml/sdtformatlock" xmlns:w16se="http://schemas.microsoft.com/office/word/2015/wordml/symex" xmlns:wpg="http://schemas.microsoft.com/office/word/2010/wordprocessingGroup" xmlns:wpi="http://schemas.microsoft.com/office/word/2010/wordprocessingInk" xmlns:wne="http://schemas.microsoft.com/office/word/2006/wordml" xmlns:wps="http://schemas.microsoft.com/office/word/2010/wordprocessingShape" mc:Ignorable="w14 w15 w16se w16cid w16 w16cex w16sdtdh w16sdtfl w16du wp14">
+  <w:abstractNum w:abstractNumId="0" w15:restartNumberingAfterBreak="0">
+    <w:nsid w:val="2CF57956"/>
+    <w:multiLevelType w:val="hybridMultilevel"/>
+    <w:tmpl w:val="CFC8CE7C"/>
+    <w:lvl w:ilvl="0" w:tplc="AAB8FB36">
+      <w:numFmt w:val="bullet"/>
+      <w:lvlText w:val=""/>
+      <w:lvlJc w:val="right"/>
+      <w:pPr>
+        <w:ind w:left="720" w:hanging="360"/>
+      </w:pPr>
+      <w:rPr>
+        <w:rFonts w:ascii="Symbol" w:eastAsiaTheme="minorHAnsi" w:hAnsi="Symbol" w:cstheme="minorBidi" w:hint="default"/>
+      </w:rPr>
+    </w:lvl>
+    <w:lvl w:ilvl="1" w:tplc="04090003" w:tentative="1">
+      <w:start w:val="1"/>
+      <w:numFmt w:val="bullet"/>
+      <w:lvlText w:val="o"/>
+      <w:lvlJc w:val="left"/>
+      <w:pPr>
+        <w:ind w:left="1440" w:hanging="360"/>
+      </w:pPr>
+      <w:rPr>
+        <w:rFonts w:ascii="Courier New" w:hAnsi="Courier New" w:cs="Courier New" w:hint="default"/>
+      </w:rPr>
+    </w:lvl>
+    <w:lvl w:ilvl="2" w:tplc="04090005" w:tentative="1">
+      <w:start w:val="1"/>
+      <w:numFmt w:val="bullet"/>
+      <w:lvlText w:val=""/>
+      <w:lvlJc w:val="left"/>
+      <w:pPr>
+        <w:ind w:left="2160" w:hanging="360"/>
+      </w:pPr>
+      <w:rPr>
+        <w:rFonts w:ascii="Wingdings" w:hAnsi="Wingdings" w:hint="default"/>
+      </w:rPr>
+    </w:lvl>
+    <w:lvl w:ilvl="3" w:tplc="04090001" w:tentative="1">
+      <w:start w:val="1"/>
+      <w:numFmt w:val="bullet"/>
+      <w:lvlText w:val=""/>
+      <w:lvlJc w:val="left"/>
+      <w:pPr>
+        <w:ind w:left="2880" w:hanging="360"/>
+      </w:pPr>
+      <w:rPr>
+        <w:rFonts w:ascii="Symbol" w:hAnsi="Symbol" w:hint="default"/>
+      </w:rPr>
+    </w:lvl>
+    <w:lvl w:ilvl="4" w:tplc="04090003" w:tentative="1">
+      <w:start w:val="1"/>
+      <w:numFmt w:val="bullet"/>
+      <w:lvlText w:val="o"/>
+      <w:lvlJc w:val="left"/>
+      <w:pPr>
+        <w:ind w:left="3600" w:hanging="360"/>
+      </w:pPr>
+      <w:rPr>
+        <w:rFonts w:ascii="Courier New" w:hAnsi="Courier New" w:cs="Courier New" w:hint="default"/>
+      </w:rPr>
+    </w:lvl>
+    <w:lvl w:ilvl="5" w:tplc="04090005" w:tentative="1">
+      <w:start w:val="1"/>
+      <w:numFmt w:val="bullet"/>
+      <w:lvlText w:val=""/>
+      <w:lvlJc w:val="left"/>
+      <w:pPr>
+        <w:ind w:left="4320" w:hanging="360"/>
+      </w:pPr>
+      <w:rPr>
+        <w:rFonts w:ascii="Wingdings" w:hAnsi="Wingdings" w:hint="default"/>
+      </w:rPr>
+    </w:lvl>
+    <w:lvl w:ilvl="6" w:tplc="04090001" w:tentative="1">
+      <w:start w:val="1"/>
+      <w:numFmt w:val="bullet"/>
+      <w:lvlText w:val=""/>
+      <w:lvlJc w:val="left"/>
+      <w:pPr>
+        <w:ind w:left="5040" w:hanging="360"/>
+      </w:pPr>
+      <w:rPr>
+        <w:rFonts w:ascii="Symbol" w:hAnsi="Symbol" w:hint="default"/>
+      </w:rPr>
+    </w:lvl>
+    <w:lvl w:ilvl="7" w:tplc="04090003" w:tentative="1">
+      <w:start w:val="1"/>
+      <w:numFmt w:val="bullet"/>
+      <w:lvlText w:val="o"/>
+      <w:lvlJc w:val="left"/>
+      <w:pPr>
+        <w:ind w:left="5760" w:hanging="360"/>
+      </w:pPr>
+      <w:rPr>
+        <w:rFonts w:ascii="Courier New" w:hAnsi="Courier New" w:cs="Courier New" w:hint="default"/>
+      </w:rPr>
+    </w:lvl>
+    <w:lvl w:ilvl="8" w:tplc="04090005" w:tentative="1">
+      <w:start w:val="1"/>
+      <w:numFmt w:val="bullet"/>
+      <w:lvlText w:val=""/>
+      <w:lvlJc w:val="left"/>
+      <w:pPr>
+        <w:ind w:left="6480" w:hanging="360"/>
+      </w:pPr>
+      <w:rPr>
+        <w:rFonts w:ascii="Wingdings" w:hAnsi="Wingdings" w:hint="default"/>
+      </w:rPr>
+    </w:lvl>
+  </w:abstractNum>
+  <w:abstractNum w:abstractNumId="1" w15:restartNumberingAfterBreak="0">
+    <w:nsid w:val="7E6B2A05"/>
+    <w:multiLevelType w:val="hybridMultilevel"/>
+    <w:tmpl w:val="A116603C"/>
+    <w:lvl w:ilvl="0" w:tplc="04090001">
+      <w:start w:val="1"/>
+      <w:numFmt w:val="bullet"/>
+      <w:lvlText w:val=""/>
+      <w:lvlJc w:val="left"/>
+      <w:pPr>
+        <w:ind w:left="720" w:hanging="360"/>
+      </w:pPr>
+      <w:rPr>
+        <w:rFonts w:ascii="Symbol" w:hAnsi="Symbol" w:hint="default"/>
+      </w:rPr>
+    </w:lvl>
+    <w:lvl w:ilvl="1" w:tplc="04090003" w:tentative="1">
+      <w:start w:val="1"/>
+      <w:numFmt w:val="bullet"/>
+      <w:lvlText w:val="o"/>
+      <w:lvlJc w:val="left"/>
+      <w:pPr>
+        <w:ind w:left="1440" w:hanging="360"/>
+      </w:pPr>
+      <w:rPr>
+        <w:rFonts w:ascii="Courier New" w:hAnsi="Courier New" w:cs="Courier New" w:hint="default"/>
+      </w:rPr>
+    </w:lvl>
+    <w:lvl w:ilvl="2" w:tplc="04090005" w:tentative="1">
+      <w:start w:val="1"/>
+      <w:numFmt w:val="bullet"/>
+      <w:lvlText w:val=""/>
+      <w:lvlJc w:val="left"/>
+      <w:pPr>
+        <w:ind w:left="2160" w:hanging="360"/>
+      </w:pPr>
+      <w:rPr>
+        <w:rFonts w:ascii="Wingdings" w:hAnsi="Wingdings" w:hint="default"/>
+      </w:rPr>
+    </w:lvl>
+    <w:lvl w:ilvl="3" w:tplc="04090001" w:tentative="1">
+      <w:start w:val="1"/>
+      <w:numFmt w:val="bullet"/>
+      <w:lvlText w:val=""/>
+      <w:lvlJc w:val="left"/>
+      <w:pPr>
+        <w:ind w:left="2880" w:hanging="360"/>
+      </w:pPr>
+      <w:rPr>
+        <w:rFonts w:ascii="Symbol" w:hAnsi="Symbol" w:hint="default"/>
+      </w:rPr>
+    </w:lvl>
+    <w:lvl w:ilvl="4" w:tplc="04090003" w:tentative="1">
+      <w:start w:val="1"/>
+      <w:numFmt w:val="bullet"/>
+      <w:lvlText w:val="o"/>
+      <w:lvlJc w:val="left"/>
+      <w:pPr>
+        <w:ind w:left="3600" w:hanging="360"/>
+      </w:pPr>
+      <w:rPr>
+        <w:rFonts w:ascii="Courier New" w:hAnsi="Courier New" w:cs="Courier New" w:hint="default"/>
+      </w:rPr>
+    </w:lvl>
+    <w:lvl w:ilvl="5" w:tplc="04090005" w:tentative="1">
+      <w:start w:val="1"/>
+      <w:numFmt w:val="bullet"/>
+      <w:lvlText w:val=""/>
+      <w:lvlJc w:val="left"/>
+      <w:pPr>
+        <w:ind w:left="4320" w:hanging="360"/>
+      </w:pPr>
+      <w:rPr>
+        <w:rFonts w:ascii="Wingdings" w:hAnsi="Wingdings" w:hint="default"/>
+      </w:rPr>
+    </w:lvl>
+    <w:lvl w:ilvl="6" w:tplc="04090001" w:tentative="1">
+      <w:start w:val="1"/>
+      <w:numFmt w:val="bullet"/>
+      <w:lvlText w:val=""/>
+      <w:lvlJc w:val="left"/>
+      <w:pPr>
+        <w:ind w:left="5040" w:hanging="360"/>
+      </w:pPr>
+      <w:rPr>
+        <w:rFonts w:ascii="Symbol" w:hAnsi="Symbol" w:hint="default"/>
+      </w:rPr>
+    </w:lvl>
+    <w:lvl w:ilvl="7" w:tplc="04090003" w:tentative="1">
+      <w:start w:val="1"/>
+      <w:numFmt w:val="bullet"/>
+      <w:lvlText w:val="o"/>
+      <w:lvlJc w:val="left"/>
+      <w:pPr>
+        <w:ind w:left="5760" w:hanging="360"/>
+      </w:pPr>
+      <w:rPr>
+        <w:rFonts w:ascii="Courier New" w:hAnsi="Courier New" w:cs="Courier New" w:hint="default"/>
+      </w:rPr>
+    </w:lvl>
+    <w:lvl w:ilvl="8" w:tplc="04090005" w:tentative="1">
+      <w:start w:val="1"/>
+      <w:numFmt w:val="bullet"/>
+      <w:lvlText w:val=""/>
+      <w:lvlJc w:val="left"/>
+      <w:pPr>
+        <w:ind w:left="6480" w:hanging="360"/>
+      </w:pPr>
+      <w:rPr>
+        <w:rFonts w:ascii="Wingdings" w:hAnsi="Wingdings" w:hint="default"/>
+      </w:rPr>
+    </w:lvl>
+  </w:abstractNum>
+  <w:num w:numId="1" w16cid:durableId="660622515">
+    <w:abstractNumId w:val="0"/>
+  </w:num>
+  <w:num w:numId="2" w16cid:durableId="1249191797">
+    <w:abstractNumId w:val="1"/>
+  </w:num>
+</w:numbering>
+</file>
+
 <file path=word/styles.xml><?xml version="1.0" encoding="utf-8"?>
 <w:styles xmlns:mc="http://schemas.openxmlformats.org/markup-compatibility/2006" xmlns:r="http://schemas.openxmlformats.org/officeDocument/2006/relationships" xmlns:w="http://schemas.openxmlformats.org/wordprocessingml/2006/main" xmlns:w14="http://schemas.microsoft.com/office/word/2010/wordml" xmlns:w15="http://schemas.microsoft.com/office/word/2012/wordml" xmlns:w16cex="http://schemas.microsoft.com/office/word/2018/wordml/cex" xmlns:w16cid="http://schemas.microsoft.com/office/word/2016/wordml/cid" xmlns:w16="http://schemas.microsoft.com/office/word/2018/wordml" xmlns:w16du="http://schemas.microsoft.com/office/word/2023/wordml/word16du" xmlns:w16sdtdh="http://schemas.microsoft.com/office/word/2020/wordml/sdtdatahash" xmlns:w16sdtfl="http://schemas.microsoft.com/office/word/2024/wordml/sdtformatlock" xmlns:w16se="http://schemas.microsoft.com/office/word/2015/wordml/symex" mc:Ignorable="w14 w15 w16se w16cid w16 w16cex w16sdtdh w16sdtfl w16du">
   <w:docDefaults>
@@ -510,15 +1332,15 @@
       <w:rPr>
         <w:rFonts w:asciiTheme="minorHAnsi" w:eastAsiaTheme="minorHAnsi" w:hAnsiTheme="minorHAnsi" w:cstheme="minorBidi"/>
         <w:kern w:val="2"/>
-        <w:sz w:val="24"/>
-        <w:szCs w:val="24"/>
+        <w:sz w:val="22"/>
+        <w:szCs w:val="22"/>
         <w:lang w:val="en-US" w:eastAsia="en-US" w:bidi="he-IL"/>
         <w14:ligatures w14:val="standardContextual"/>
       </w:rPr>
     </w:rPrDefault>
     <w:pPrDefault>
       <w:pPr>
-        <w:spacing w:after="160" w:line="278" w:lineRule="auto"/>
+        <w:spacing w:after="160" w:line="259" w:lineRule="auto"/>
       </w:pPr>
     </w:pPrDefault>
   </w:docDefaults>
@@ -903,6 +1725,7 @@
   <w:style w:type="paragraph" w:default="1" w:styleId="a">
     <w:name w:val="Normal"/>
     <w:qFormat/>
+    <w:rsid w:val="00FC06C8"/>
     <w:pPr>
       <w:bidi/>
     </w:pPr>
@@ -914,7 +1737,7 @@
     <w:link w:val="10"/>
     <w:uiPriority w:val="9"/>
     <w:qFormat/>
-    <w:rsid w:val="00C805B0"/>
+    <w:rsid w:val="003A1035"/>
     <w:pPr>
       <w:keepNext/>
       <w:keepLines/>
@@ -937,7 +1760,7 @@
     <w:semiHidden/>
     <w:unhideWhenUsed/>
     <w:qFormat/>
-    <w:rsid w:val="00C805B0"/>
+    <w:rsid w:val="003A1035"/>
     <w:pPr>
       <w:keepNext/>
       <w:keepLines/>
@@ -960,7 +1783,7 @@
     <w:semiHidden/>
     <w:unhideWhenUsed/>
     <w:qFormat/>
-    <w:rsid w:val="00C805B0"/>
+    <w:rsid w:val="003A1035"/>
     <w:pPr>
       <w:keepNext/>
       <w:keepLines/>
@@ -983,7 +1806,7 @@
     <w:semiHidden/>
     <w:unhideWhenUsed/>
     <w:qFormat/>
-    <w:rsid w:val="00C805B0"/>
+    <w:rsid w:val="003A1035"/>
     <w:pPr>
       <w:keepNext/>
       <w:keepLines/>
@@ -1006,7 +1829,7 @@
     <w:semiHidden/>
     <w:unhideWhenUsed/>
     <w:qFormat/>
-    <w:rsid w:val="00C805B0"/>
+    <w:rsid w:val="003A1035"/>
     <w:pPr>
       <w:keepNext/>
       <w:keepLines/>
@@ -1027,7 +1850,7 @@
     <w:semiHidden/>
     <w:unhideWhenUsed/>
     <w:qFormat/>
-    <w:rsid w:val="00C805B0"/>
+    <w:rsid w:val="003A1035"/>
     <w:pPr>
       <w:keepNext/>
       <w:keepLines/>
@@ -1050,7 +1873,7 @@
     <w:semiHidden/>
     <w:unhideWhenUsed/>
     <w:qFormat/>
-    <w:rsid w:val="00C805B0"/>
+    <w:rsid w:val="003A1035"/>
     <w:pPr>
       <w:keepNext/>
       <w:keepLines/>
@@ -1071,7 +1894,7 @@
     <w:semiHidden/>
     <w:unhideWhenUsed/>
     <w:qFormat/>
-    <w:rsid w:val="00C805B0"/>
+    <w:rsid w:val="003A1035"/>
     <w:pPr>
       <w:keepNext/>
       <w:keepLines/>
@@ -1094,7 +1917,7 @@
     <w:semiHidden/>
     <w:unhideWhenUsed/>
     <w:qFormat/>
-    <w:rsid w:val="00C805B0"/>
+    <w:rsid w:val="003A1035"/>
     <w:pPr>
       <w:keepNext/>
       <w:keepLines/>
@@ -1109,7 +1932,6 @@
   <w:style w:type="character" w:default="1" w:styleId="a0">
     <w:name w:val="Default Paragraph Font"/>
     <w:uiPriority w:val="1"/>
-    <w:semiHidden/>
     <w:unhideWhenUsed/>
   </w:style>
   <w:style w:type="table" w:default="1" w:styleId="a1">
@@ -1138,7 +1960,7 @@
     <w:basedOn w:val="a0"/>
     <w:link w:val="1"/>
     <w:uiPriority w:val="9"/>
-    <w:rsid w:val="00C805B0"/>
+    <w:rsid w:val="003A1035"/>
     <w:rPr>
       <w:rFonts w:asciiTheme="majorHAnsi" w:eastAsiaTheme="majorEastAsia" w:hAnsiTheme="majorHAnsi" w:cstheme="majorBidi"/>
       <w:color w:val="0F4761" w:themeColor="accent1" w:themeShade="BF"/>
@@ -1152,7 +1974,7 @@
     <w:link w:val="2"/>
     <w:uiPriority w:val="9"/>
     <w:semiHidden/>
-    <w:rsid w:val="00C805B0"/>
+    <w:rsid w:val="003A1035"/>
     <w:rPr>
       <w:rFonts w:asciiTheme="majorHAnsi" w:eastAsiaTheme="majorEastAsia" w:hAnsiTheme="majorHAnsi" w:cstheme="majorBidi"/>
       <w:color w:val="0F4761" w:themeColor="accent1" w:themeShade="BF"/>
@@ -1166,7 +1988,7 @@
     <w:link w:val="3"/>
     <w:uiPriority w:val="9"/>
     <w:semiHidden/>
-    <w:rsid w:val="00C805B0"/>
+    <w:rsid w:val="003A1035"/>
     <w:rPr>
       <w:rFonts w:eastAsiaTheme="majorEastAsia" w:cstheme="majorBidi"/>
       <w:color w:val="0F4761" w:themeColor="accent1" w:themeShade="BF"/>
@@ -1180,7 +2002,7 @@
     <w:link w:val="4"/>
     <w:uiPriority w:val="9"/>
     <w:semiHidden/>
-    <w:rsid w:val="00C805B0"/>
+    <w:rsid w:val="003A1035"/>
     <w:rPr>
       <w:rFonts w:eastAsiaTheme="majorEastAsia" w:cstheme="majorBidi"/>
       <w:i/>
@@ -1194,7 +2016,7 @@
     <w:link w:val="5"/>
     <w:uiPriority w:val="9"/>
     <w:semiHidden/>
-    <w:rsid w:val="00C805B0"/>
+    <w:rsid w:val="003A1035"/>
     <w:rPr>
       <w:rFonts w:eastAsiaTheme="majorEastAsia" w:cstheme="majorBidi"/>
       <w:color w:val="0F4761" w:themeColor="accent1" w:themeShade="BF"/>
@@ -1206,7 +2028,7 @@
     <w:link w:val="6"/>
     <w:uiPriority w:val="9"/>
     <w:semiHidden/>
-    <w:rsid w:val="00C805B0"/>
+    <w:rsid w:val="003A1035"/>
     <w:rPr>
       <w:rFonts w:eastAsiaTheme="majorEastAsia" w:cstheme="majorBidi"/>
       <w:i/>
@@ -1220,7 +2042,7 @@
     <w:link w:val="7"/>
     <w:uiPriority w:val="9"/>
     <w:semiHidden/>
-    <w:rsid w:val="00C805B0"/>
+    <w:rsid w:val="003A1035"/>
     <w:rPr>
       <w:rFonts w:eastAsiaTheme="majorEastAsia" w:cstheme="majorBidi"/>
       <w:color w:val="595959" w:themeColor="text1" w:themeTint="A6"/>
@@ -1232,7 +2054,7 @@
     <w:link w:val="8"/>
     <w:uiPriority w:val="9"/>
     <w:semiHidden/>
-    <w:rsid w:val="00C805B0"/>
+    <w:rsid w:val="003A1035"/>
     <w:rPr>
       <w:rFonts w:eastAsiaTheme="majorEastAsia" w:cstheme="majorBidi"/>
       <w:i/>
@@ -1246,7 +2068,7 @@
     <w:link w:val="9"/>
     <w:uiPriority w:val="9"/>
     <w:semiHidden/>
-    <w:rsid w:val="00C805B0"/>
+    <w:rsid w:val="003A1035"/>
     <w:rPr>
       <w:rFonts w:eastAsiaTheme="majorEastAsia" w:cstheme="majorBidi"/>
       <w:color w:val="272727" w:themeColor="text1" w:themeTint="D8"/>
@@ -1259,7 +2081,7 @@
     <w:link w:val="a4"/>
     <w:uiPriority w:val="10"/>
     <w:qFormat/>
-    <w:rsid w:val="00C805B0"/>
+    <w:rsid w:val="003A1035"/>
     <w:pPr>
       <w:spacing w:after="80" w:line="240" w:lineRule="auto"/>
       <w:contextualSpacing/>
@@ -1277,7 +2099,7 @@
     <w:basedOn w:val="a0"/>
     <w:link w:val="a3"/>
     <w:uiPriority w:val="10"/>
-    <w:rsid w:val="00C805B0"/>
+    <w:rsid w:val="003A1035"/>
     <w:rPr>
       <w:rFonts w:asciiTheme="majorHAnsi" w:eastAsiaTheme="majorEastAsia" w:hAnsiTheme="majorHAnsi" w:cstheme="majorBidi"/>
       <w:spacing w:val="-10"/>
@@ -1293,7 +2115,7 @@
     <w:link w:val="a6"/>
     <w:uiPriority w:val="11"/>
     <w:qFormat/>
-    <w:rsid w:val="00C805B0"/>
+    <w:rsid w:val="003A1035"/>
     <w:pPr>
       <w:numPr>
         <w:ilvl w:val="1"/>
@@ -1312,7 +2134,7 @@
     <w:basedOn w:val="a0"/>
     <w:link w:val="a5"/>
     <w:uiPriority w:val="11"/>
-    <w:rsid w:val="00C805B0"/>
+    <w:rsid w:val="003A1035"/>
     <w:rPr>
       <w:rFonts w:eastAsiaTheme="majorEastAsia" w:cstheme="majorBidi"/>
       <w:color w:val="595959" w:themeColor="text1" w:themeTint="A6"/>
@@ -1328,7 +2150,7 @@
     <w:link w:val="a8"/>
     <w:uiPriority w:val="29"/>
     <w:qFormat/>
-    <w:rsid w:val="00C805B0"/>
+    <w:rsid w:val="003A1035"/>
     <w:pPr>
       <w:spacing w:before="160"/>
       <w:jc w:val="center"/>
@@ -1344,7 +2166,7 @@
     <w:basedOn w:val="a0"/>
     <w:link w:val="a7"/>
     <w:uiPriority w:val="29"/>
-    <w:rsid w:val="00C805B0"/>
+    <w:rsid w:val="003A1035"/>
     <w:rPr>
       <w:i/>
       <w:iCs/>
@@ -1356,7 +2178,7 @@
     <w:basedOn w:val="a"/>
     <w:uiPriority w:val="34"/>
     <w:qFormat/>
-    <w:rsid w:val="00C805B0"/>
+    <w:rsid w:val="003A1035"/>
     <w:pPr>
       <w:ind w:left="720"/>
       <w:contextualSpacing/>
@@ -1367,7 +2189,7 @@
     <w:basedOn w:val="a0"/>
     <w:uiPriority w:val="21"/>
     <w:qFormat/>
-    <w:rsid w:val="00C805B0"/>
+    <w:rsid w:val="003A1035"/>
     <w:rPr>
       <w:i/>
       <w:iCs/>
@@ -1381,7 +2203,7 @@
     <w:link w:val="ac"/>
     <w:uiPriority w:val="30"/>
     <w:qFormat/>
-    <w:rsid w:val="00C805B0"/>
+    <w:rsid w:val="003A1035"/>
     <w:pPr>
       <w:pBdr>
         <w:top w:val="single" w:sz="4" w:space="10" w:color="0F4761" w:themeColor="accent1" w:themeShade="BF"/>
@@ -1402,7 +2224,7 @@
     <w:basedOn w:val="a0"/>
     <w:link w:val="ab"/>
     <w:uiPriority w:val="30"/>
-    <w:rsid w:val="00C805B0"/>
+    <w:rsid w:val="003A1035"/>
     <w:rPr>
       <w:i/>
       <w:iCs/>
@@ -1414,7 +2236,7 @@
     <w:basedOn w:val="a0"/>
     <w:uiPriority w:val="32"/>
     <w:qFormat/>
-    <w:rsid w:val="00C805B0"/>
+    <w:rsid w:val="003A1035"/>
     <w:rPr>
       <w:b/>
       <w:bCs/>
@@ -1422,6 +2244,82 @@
       <w:color w:val="0F4761" w:themeColor="accent1" w:themeShade="BF"/>
       <w:spacing w:val="5"/>
     </w:rPr>
+  </w:style>
+  <w:style w:type="table" w:styleId="4-4">
+    <w:name w:val="Grid Table 4 Accent 4"/>
+    <w:basedOn w:val="a1"/>
+    <w:uiPriority w:val="49"/>
+    <w:rsid w:val="003A1035"/>
+    <w:pPr>
+      <w:spacing w:after="0" w:line="240" w:lineRule="auto"/>
+    </w:pPr>
+    <w:tblPr>
+      <w:tblStyleRowBandSize w:val="1"/>
+      <w:tblStyleColBandSize w:val="1"/>
+      <w:tblBorders>
+        <w:top w:val="single" w:sz="4" w:space="0" w:color="60CAF3" w:themeColor="accent4" w:themeTint="99"/>
+        <w:left w:val="single" w:sz="4" w:space="0" w:color="60CAF3" w:themeColor="accent4" w:themeTint="99"/>
+        <w:bottom w:val="single" w:sz="4" w:space="0" w:color="60CAF3" w:themeColor="accent4" w:themeTint="99"/>
+        <w:right w:val="single" w:sz="4" w:space="0" w:color="60CAF3" w:themeColor="accent4" w:themeTint="99"/>
+        <w:insideH w:val="single" w:sz="4" w:space="0" w:color="60CAF3" w:themeColor="accent4" w:themeTint="99"/>
+        <w:insideV w:val="single" w:sz="4" w:space="0" w:color="60CAF3" w:themeColor="accent4" w:themeTint="99"/>
+      </w:tblBorders>
+    </w:tblPr>
+    <w:tblStylePr w:type="firstRow">
+      <w:rPr>
+        <w:b/>
+        <w:bCs/>
+        <w:color w:val="FFFFFF" w:themeColor="background1"/>
+      </w:rPr>
+      <w:tblPr/>
+      <w:tcPr>
+        <w:tcBorders>
+          <w:top w:val="single" w:sz="4" w:space="0" w:color="0F9ED5" w:themeColor="accent4"/>
+          <w:left w:val="single" w:sz="4" w:space="0" w:color="0F9ED5" w:themeColor="accent4"/>
+          <w:bottom w:val="single" w:sz="4" w:space="0" w:color="0F9ED5" w:themeColor="accent4"/>
+          <w:right w:val="single" w:sz="4" w:space="0" w:color="0F9ED5" w:themeColor="accent4"/>
+          <w:insideH w:val="nil"/>
+          <w:insideV w:val="nil"/>
+        </w:tcBorders>
+        <w:shd w:val="clear" w:color="auto" w:fill="0F9ED5" w:themeFill="accent4"/>
+      </w:tcPr>
+    </w:tblStylePr>
+    <w:tblStylePr w:type="lastRow">
+      <w:rPr>
+        <w:b/>
+        <w:bCs/>
+      </w:rPr>
+      <w:tblPr/>
+      <w:tcPr>
+        <w:tcBorders>
+          <w:top w:val="double" w:sz="4" w:space="0" w:color="0F9ED5" w:themeColor="accent4"/>
+        </w:tcBorders>
+      </w:tcPr>
+    </w:tblStylePr>
+    <w:tblStylePr w:type="firstCol">
+      <w:rPr>
+        <w:b/>
+        <w:bCs/>
+      </w:rPr>
+    </w:tblStylePr>
+    <w:tblStylePr w:type="lastCol">
+      <w:rPr>
+        <w:b/>
+        <w:bCs/>
+      </w:rPr>
+    </w:tblStylePr>
+    <w:tblStylePr w:type="band1Vert">
+      <w:tblPr/>
+      <w:tcPr>
+        <w:shd w:val="clear" w:color="auto" w:fill="CAEDFB" w:themeFill="accent4" w:themeFillTint="33"/>
+      </w:tcPr>
+    </w:tblStylePr>
+    <w:tblStylePr w:type="band1Horz">
+      <w:tblPr/>
+      <w:tcPr>
+        <w:shd w:val="clear" w:color="auto" w:fill="CAEDFB" w:themeFill="accent4" w:themeFillTint="33"/>
+      </w:tcPr>
+    </w:tblStylePr>
   </w:style>
 </w:styles>
 </file>
@@ -1524,7 +2422,7 @@
         <a:latin typeface="Aptos" panose="02110004020202020204"/>
         <a:ea typeface=""/>
         <a:cs typeface=""/>
-        <a:font script="Jpan" typeface="游明朝"/>
+        <a:font script="Jpan" typeface="游ゴシック"/>
         <a:font script="Hang" typeface="맑은 고딕"/>
         <a:font script="Hans" typeface="等线"/>
         <a:font script="Hant" typeface="新細明體"/>
@@ -1715,7 +2613,7 @@
   <a:extraClrSchemeLst/>
   <a:extLst>
     <a:ext uri="{05A4C25C-085E-4340-85A3-A5531E510DB2}">
-      <thm15:themeFamily xmlns:thm15="http://schemas.microsoft.com/office/thememl/2012/main" name="Office Theme" id="{2E142A2C-CD16-42D6-873A-C26D2A0506FA}" vid="{1BDDFF52-6CD6-40A5-AB3C-68EB2F1E4D0A}"/>
+      <thm15:themeFamily xmlns:thm15="http://schemas.microsoft.com/office/thememl/2012/main" name="Office Theme" id="{62F939B6-93AF-4DB8-9C6B-D6C7DFDC589F}" vid="{4A3C46E8-61CC-4603-A589-7422A47A8E4A}"/>
     </a:ext>
   </a:extLst>
 </a:theme>

</xml_diff>